<commit_message>
Configure Telegram source messages and NPD pricing
</commit_message>
<xml_diff>
--- a/docs/public_offer.docx
+++ b/docs/public_offer.docx
@@ -59,7 +59,7 @@
         <w:jc w:val="both"/>
       </w:pPr>
       <w:r>
-        <w:t>1.1. Настоящий документ является публичным предложением Лобановой Марии Андреевны, ИНН 695013964534 (далее — «Исполнитель»), заключить договор с дееспособным физическим лицом (далее — «Заказчик») на условиях, изложенных ниже.</w:t>
+        <w:t>1.1. Настоящий документ является публичным предложением Лобановой Марии Андреевны, ИНН 695013964534, применяющей специальный налоговый режим «Налог на профессиональный доход» (далее — «Исполнитель»), заключить договор с дееспособным физическим лицом (далее — «Заказчик») на условиях, изложенных ниже.</w:t>
       </w:r>
     </w:p>
     <w:p>
@@ -523,6 +523,15 @@
         <w:jc w:val="both"/>
       </w:pPr>
       <w:r>
+        <w:t>Статус: налогоплательщик налога на профессиональный доход (самозанятая)</w:t>
+      </w:r>
+    </w:p>
+    <w:p>
+      <w:pPr>
+        <w:ind w:firstLine="425"/>
+        <w:jc w:val="both"/>
+      </w:pPr>
+      <w:r>
         <w:t>Адрес: г. Тверь, ул. Богданова, д. 33/15</w:t>
       </w:r>
     </w:p>

</xml_diff>